<commit_message>
DL lab 8 class added
</commit_message>
<xml_diff>
--- a/SEM 3/Big Data Analytics/LAB/DA2.docx
+++ b/SEM 3/Big Data Analytics/LAB/DA2.docx
@@ -154,7 +154,7 @@
                     <pic:cNvPicPr/>
                   </pic:nvPicPr>
                   <pic:blipFill>
-                    <a:blip r:embed="rId4" cstate="print">
+                    <a:blip r:embed="rId5" cstate="print">
                       <a:extLst>
                         <a:ext uri="{28A0092B-C50C-407E-A947-70E740481C1C}">
                           <a14:useLocalDpi xmlns:a14="http://schemas.microsoft.com/office/drawing/2010/main" val="0"/>
@@ -455,41 +455,55 @@
     <w:p>
       <w:pPr>
         <w:rPr>
-          <w:b/>
-          <w:sz w:val="28"/>
-        </w:rPr>
-      </w:pPr>
-    </w:p>
-    <w:p>
-      <w:pPr>
-        <w:rPr>
-          <w:b/>
-          <w:sz w:val="28"/>
-        </w:rPr>
-      </w:pPr>
-    </w:p>
-    <w:p>
-      <w:pPr>
-        <w:rPr>
-          <w:sz w:val="28"/>
-        </w:rPr>
-      </w:pPr>
-      <w:r>
-        <w:rPr>
-          <w:b/>
-          <w:sz w:val="28"/>
-        </w:rPr>
-        <w:t>Step 1:</w:t>
-      </w:r>
-      <w:r>
-        <w:rPr>
-          <w:sz w:val="28"/>
-        </w:rPr>
-        <w:t xml:space="preserve"> Check java version</w:t>
-      </w:r>
-    </w:p>
-    <w:p>
-      <w:pPr>
+          <w:sz w:val="28"/>
+        </w:rPr>
+      </w:pPr>
+      <w:r>
+        <w:rPr>
+          <w:b/>
+          <w:sz w:val="28"/>
+        </w:rPr>
+        <w:t>Start</w:t>
+      </w:r>
+      <w:r>
+        <w:rPr>
+          <w:b/>
+          <w:sz w:val="28"/>
+        </w:rPr>
+        <w:t>:</w:t>
+      </w:r>
+      <w:r>
+        <w:rPr>
+          <w:sz w:val="28"/>
+        </w:rPr>
+        <w:t xml:space="preserve"> </w:t>
+      </w:r>
+    </w:p>
+    <w:p>
+      <w:pPr>
+        <w:pStyle w:val="ListParagraph"/>
+        <w:numPr>
+          <w:ilvl w:val="0"/>
+          <w:numId w:val="1"/>
+        </w:numPr>
+        <w:rPr>
+          <w:sz w:val="28"/>
+        </w:rPr>
+      </w:pPr>
+      <w:r>
+        <w:rPr>
+          <w:sz w:val="28"/>
+        </w:rPr>
+        <w:t>start-dfs.sh</w:t>
+      </w:r>
+    </w:p>
+    <w:p>
+      <w:pPr>
+        <w:pStyle w:val="ListParagraph"/>
+        <w:numPr>
+          <w:ilvl w:val="0"/>
+          <w:numId w:val="1"/>
+        </w:numPr>
         <w:rPr>
           <w:sz w:val="28"/>
         </w:rPr>
@@ -497,154 +511,1209 @@
       <w:r>
         <w:rPr>
           <w:noProof/>
-          <w:sz w:val="28"/>
-          <w:lang w:eastAsia="en-IN"/>
-        </w:rPr>
-        <w:drawing>
-          <wp:inline distT="0" distB="0" distL="0" distR="0" wp14:anchorId="58650928" wp14:editId="72729D63">
-            <wp:extent cx="4972744" cy="800212"/>
-            <wp:effectExtent l="0" t="0" r="0" b="0"/>
-            <wp:docPr id="4" name="Picture 4"/>
-            <wp:cNvGraphicFramePr>
-              <a:graphicFrameLocks xmlns:a="http://schemas.openxmlformats.org/drawingml/2006/main" noChangeAspect="1"/>
-            </wp:cNvGraphicFramePr>
-            <a:graphic xmlns:a="http://schemas.openxmlformats.org/drawingml/2006/main">
-              <a:graphicData uri="http://schemas.openxmlformats.org/drawingml/2006/picture">
-                <pic:pic xmlns:pic="http://schemas.openxmlformats.org/drawingml/2006/picture">
-                  <pic:nvPicPr>
-                    <pic:cNvPr id="1" name=""/>
-                    <pic:cNvPicPr/>
-                  </pic:nvPicPr>
-                  <pic:blipFill>
-                    <a:blip r:embed="rId5"/>
-                    <a:stretch>
-                      <a:fillRect/>
-                    </a:stretch>
-                  </pic:blipFill>
-                  <pic:spPr>
-                    <a:xfrm>
-                      <a:off x="0" y="0"/>
-                      <a:ext cx="4972744" cy="800212"/>
-                    </a:xfrm>
-                    <a:prstGeom prst="rect">
-                      <a:avLst/>
-                    </a:prstGeom>
-                  </pic:spPr>
-                </pic:pic>
-              </a:graphicData>
-            </a:graphic>
-          </wp:inline>
-        </w:drawing>
-      </w:r>
-    </w:p>
-    <w:p>
-      <w:pPr>
-        <w:rPr>
-          <w:b/>
-          <w:sz w:val="28"/>
-        </w:rPr>
-      </w:pPr>
-    </w:p>
-    <w:p>
-      <w:pPr>
-        <w:rPr>
-          <w:b/>
-          <w:sz w:val="28"/>
-        </w:rPr>
-      </w:pPr>
-    </w:p>
-    <w:p>
-      <w:pPr>
-        <w:rPr>
-          <w:sz w:val="28"/>
-        </w:rPr>
-      </w:pPr>
-      <w:r>
-        <w:rPr>
-          <w:b/>
-          <w:sz w:val="28"/>
-        </w:rPr>
-        <w:t>Step 2:</w:t>
-      </w:r>
-      <w:r>
-        <w:rPr>
-          <w:sz w:val="28"/>
-        </w:rPr>
-        <w:t xml:space="preserve"> Check Hadoop version</w:t>
-      </w:r>
-    </w:p>
-    <w:p>
-      <w:pPr>
-        <w:rPr>
+        </w:rPr>
+        <w:pict>
+          <v:shapetype id="_x0000_t75" coordsize="21600,21600" o:spt="75" o:preferrelative="t" path="m@4@5l@4@11@9@11@9@5xe" filled="f" stroked="f">
+            <v:stroke joinstyle="miter"/>
+            <v:formulas>
+              <v:f eqn="if lineDrawn pixelLineWidth 0"/>
+              <v:f eqn="sum @0 1 0"/>
+              <v:f eqn="sum 0 0 @1"/>
+              <v:f eqn="prod @2 1 2"/>
+              <v:f eqn="prod @3 21600 pixelWidth"/>
+              <v:f eqn="prod @3 21600 pixelHeight"/>
+              <v:f eqn="sum @0 0 1"/>
+              <v:f eqn="prod @6 1 2"/>
+              <v:f eqn="prod @7 21600 pixelWidth"/>
+              <v:f eqn="sum @8 21600 0"/>
+              <v:f eqn="prod @7 21600 pixelHeight"/>
+              <v:f eqn="sum @10 21600 0"/>
+            </v:formulas>
+            <v:path o:extrusionok="f" gradientshapeok="t" o:connecttype="rect"/>
+            <o:lock v:ext="edit" aspectratio="t"/>
+          </v:shapetype>
+          <v:shape id="_x0000_s1026" type="#_x0000_t75" style="position:absolute;left:0;text-align:left;margin-left:0;margin-top:30.7pt;width:451pt;height:109.55pt;z-index:-251654144;mso-position-horizontal-relative:text;mso-position-vertical-relative:text;mso-width-relative:page;mso-height-relative:page" wrapcoords="-36 0 -36 21452 21600 21452 21600 0 -36 0">
+            <v:imagedata r:id="rId6" o:title="Screenshot from 2025-09-12 12-09-32"/>
+            <w10:wrap type="tight"/>
+          </v:shape>
+        </w:pict>
+      </w:r>
+      <w:r>
+        <w:rPr>
+          <w:sz w:val="28"/>
+        </w:rPr>
+        <w:t>start-yarn.sh</w:t>
+      </w:r>
+    </w:p>
+    <w:p>
+      <w:pPr>
+        <w:rPr>
+          <w:sz w:val="28"/>
+        </w:rPr>
+      </w:pPr>
+      <w:r>
+        <w:rPr>
+          <w:sz w:val="28"/>
+        </w:rPr>
+        <w:t>Hadoop DFS running on localhost:9870</w:t>
+      </w:r>
+    </w:p>
+    <w:p>
+      <w:pPr>
+        <w:rPr>
+          <w:b/>
           <w:sz w:val="28"/>
         </w:rPr>
       </w:pPr>
       <w:r>
         <w:rPr>
           <w:noProof/>
-          <w:sz w:val="28"/>
-          <w:lang w:eastAsia="en-IN"/>
-        </w:rPr>
-        <w:drawing>
-          <wp:inline distT="0" distB="0" distL="0" distR="0" wp14:anchorId="074FA061" wp14:editId="0BFCE0E9">
-            <wp:extent cx="4348716" cy="850575"/>
-            <wp:effectExtent l="0" t="0" r="0" b="6985"/>
-            <wp:docPr id="5" name="Picture 5"/>
-            <wp:cNvGraphicFramePr>
-              <a:graphicFrameLocks xmlns:a="http://schemas.openxmlformats.org/drawingml/2006/main" noChangeAspect="1"/>
-            </wp:cNvGraphicFramePr>
-            <a:graphic xmlns:a="http://schemas.openxmlformats.org/drawingml/2006/main">
-              <a:graphicData uri="http://schemas.openxmlformats.org/drawingml/2006/picture">
-                <pic:pic xmlns:pic="http://schemas.openxmlformats.org/drawingml/2006/picture">
-                  <pic:nvPicPr>
-                    <pic:cNvPr id="1" name=""/>
-                    <pic:cNvPicPr/>
-                  </pic:nvPicPr>
-                  <pic:blipFill>
-                    <a:blip r:embed="rId6"/>
-                    <a:stretch>
-                      <a:fillRect/>
-                    </a:stretch>
-                  </pic:blipFill>
-                  <pic:spPr>
-                    <a:xfrm>
-                      <a:off x="0" y="0"/>
-                      <a:ext cx="4475695" cy="875411"/>
-                    </a:xfrm>
-                    <a:prstGeom prst="rect">
-                      <a:avLst/>
-                    </a:prstGeom>
-                  </pic:spPr>
-                </pic:pic>
-              </a:graphicData>
-            </a:graphic>
-          </wp:inline>
-        </w:drawing>
-      </w:r>
-    </w:p>
-    <w:p>
-      <w:pPr>
-        <w:rPr>
-          <w:b/>
-          <w:sz w:val="28"/>
-        </w:rPr>
-      </w:pPr>
-    </w:p>
-    <w:p>
-      <w:pPr>
-        <w:rPr>
-          <w:b/>
-          <w:sz w:val="28"/>
-        </w:rPr>
-      </w:pPr>
-    </w:p>
-    <w:p>
-      <w:pPr>
-        <w:rPr>
-          <w:b/>
-          <w:sz w:val="28"/>
-        </w:rPr>
-      </w:pPr>
+        </w:rPr>
+        <w:pict>
+          <v:shape id="_x0000_s1041" type="#_x0000_t75" style="position:absolute;margin-left:168.45pt;margin-top:26.25pt;width:274.65pt;height:155.5pt;z-index:-251623424;mso-position-horizontal-relative:text;mso-position-vertical-relative:text;mso-width-relative:page;mso-height-relative:page" wrapcoords="-59 -104 -59 21600 21659 21600 21659 -104 -59 -104" stroked="t" strokecolor="black [3213]">
+            <v:imagedata r:id="rId7" o:title="Screenshot from 2025-09-12 13-06-42"/>
+            <w10:wrap type="tight"/>
+          </v:shape>
+        </w:pict>
+      </w:r>
+      <w:r>
+        <w:rPr>
+          <w:b/>
+          <w:sz w:val="28"/>
+        </w:rPr>
+        <w:t>Check Process Status</w:t>
+      </w:r>
+    </w:p>
+    <w:p>
+      <w:pPr>
+        <w:pStyle w:val="ListParagraph"/>
+        <w:numPr>
+          <w:ilvl w:val="0"/>
+          <w:numId w:val="1"/>
+        </w:numPr>
+        <w:rPr>
+          <w:sz w:val="28"/>
+        </w:rPr>
+      </w:pPr>
+      <w:r>
+        <w:rPr>
+          <w:noProof/>
+        </w:rPr>
+        <w:pict>
+          <v:shape id="_x0000_s1027" type="#_x0000_t75" style="position:absolute;left:0;text-align:left;margin-left:-.85pt;margin-top:35.7pt;width:158.55pt;height:79.05pt;z-index:-251652096;mso-position-horizontal-relative:text;mso-position-vertical-relative:text;mso-width-relative:page;mso-height-relative:page" wrapcoords="-86 0 -86 21394 21600 21394 21600 0 -86 0">
+            <v:imagedata r:id="rId8" o:title="Screenshot from 2025-09-12 12-11-52" cropright="38254f"/>
+            <w10:wrap type="tight"/>
+          </v:shape>
+        </w:pict>
+      </w:r>
+      <w:proofErr w:type="spellStart"/>
+      <w:r>
+        <w:rPr>
+          <w:sz w:val="28"/>
+        </w:rPr>
+        <w:t>jps</w:t>
+      </w:r>
+      <w:proofErr w:type="spellEnd"/>
+    </w:p>
+    <w:p>
+      <w:pPr>
+        <w:rPr>
+          <w:sz w:val="28"/>
+        </w:rPr>
+      </w:pPr>
+    </w:p>
+    <w:p>
+      <w:pPr>
+        <w:rPr>
+          <w:b/>
+          <w:sz w:val="28"/>
+        </w:rPr>
+      </w:pPr>
+    </w:p>
+    <w:p>
+      <w:pPr>
+        <w:rPr>
+          <w:b/>
+          <w:sz w:val="28"/>
+        </w:rPr>
+      </w:pPr>
+      <w:r>
+        <w:rPr>
+          <w:b/>
+          <w:sz w:val="28"/>
+        </w:rPr>
+        <w:lastRenderedPageBreak/>
+        <w:t>List Root Directories:</w:t>
+      </w:r>
+    </w:p>
+    <w:p>
+      <w:pPr>
+        <w:pStyle w:val="ListParagraph"/>
+        <w:numPr>
+          <w:ilvl w:val="0"/>
+          <w:numId w:val="1"/>
+        </w:numPr>
+        <w:rPr>
+          <w:sz w:val="28"/>
+        </w:rPr>
+      </w:pPr>
+      <w:r>
+        <w:rPr>
+          <w:noProof/>
+        </w:rPr>
+        <w:pict>
+          <v:shape id="_x0000_s1028" type="#_x0000_t75" style="position:absolute;left:0;text-align:left;margin-left:0;margin-top:31.35pt;width:451pt;height:74.7pt;z-index:-251650048;mso-position-horizontal-relative:text;mso-position-vertical-relative:text;mso-width-relative:page;mso-height-relative:page" wrapcoords="-36 0 -36 21384 21600 21384 21600 0 -36 0">
+            <v:imagedata r:id="rId9" o:title="Screenshot from 2025-09-12 12-24-22"/>
+            <w10:wrap type="tight"/>
+          </v:shape>
+        </w:pict>
+      </w:r>
+      <w:proofErr w:type="spellStart"/>
+      <w:r>
+        <w:rPr>
+          <w:sz w:val="28"/>
+        </w:rPr>
+        <w:t>hdfs</w:t>
+      </w:r>
+      <w:proofErr w:type="spellEnd"/>
+      <w:r>
+        <w:rPr>
+          <w:sz w:val="28"/>
+        </w:rPr>
+        <w:t xml:space="preserve"> </w:t>
+      </w:r>
+      <w:proofErr w:type="spellStart"/>
+      <w:r>
+        <w:rPr>
+          <w:sz w:val="28"/>
+        </w:rPr>
+        <w:t>dfs</w:t>
+      </w:r>
+      <w:proofErr w:type="spellEnd"/>
+      <w:r>
+        <w:rPr>
+          <w:sz w:val="28"/>
+        </w:rPr>
+        <w:t>–ls /</w:t>
+      </w:r>
+    </w:p>
+    <w:p>
+      <w:pPr>
+        <w:rPr>
+          <w:sz w:val="28"/>
+        </w:rPr>
+      </w:pPr>
+      <w:r>
+        <w:rPr>
+          <w:noProof/>
+        </w:rPr>
+        <w:pict>
+          <v:shape id="_x0000_s1029" type="#_x0000_t75" style="position:absolute;margin-left:1.35pt;margin-top:110.85pt;width:450.35pt;height:190.85pt;z-index:-251648000;mso-position-horizontal-relative:text;mso-position-vertical-relative:text;mso-width-relative:page;mso-height-relative:page" wrapcoords="-36 -85 -36 21600 21636 21600 21636 -85 -36 -85" stroked="t" strokecolor="#272727 [2749]">
+            <v:imagedata r:id="rId10" o:title="Screenshot from 2025-09-12 12-35-42"/>
+            <w10:wrap type="tight"/>
+          </v:shape>
+        </w:pict>
+      </w:r>
+    </w:p>
+    <w:p>
+      <w:pPr>
+        <w:ind w:left="360"/>
+        <w:rPr>
+          <w:sz w:val="28"/>
+        </w:rPr>
+      </w:pPr>
+    </w:p>
+    <w:p>
+      <w:pPr>
+        <w:rPr>
+          <w:b/>
+          <w:sz w:val="28"/>
+        </w:rPr>
+      </w:pPr>
+      <w:r>
+        <w:rPr>
+          <w:b/>
+          <w:sz w:val="28"/>
+        </w:rPr>
+        <w:t>Create Directory:</w:t>
+      </w:r>
+    </w:p>
+    <w:p>
+      <w:pPr>
+        <w:pStyle w:val="ListParagraph"/>
+        <w:numPr>
+          <w:ilvl w:val="0"/>
+          <w:numId w:val="1"/>
+        </w:numPr>
+        <w:rPr>
+          <w:sz w:val="28"/>
+        </w:rPr>
+      </w:pPr>
+      <w:proofErr w:type="spellStart"/>
+      <w:r>
+        <w:rPr>
+          <w:sz w:val="28"/>
+        </w:rPr>
+        <w:t>hdfs</w:t>
+      </w:r>
+      <w:proofErr w:type="spellEnd"/>
+      <w:r>
+        <w:rPr>
+          <w:sz w:val="28"/>
+        </w:rPr>
+        <w:t xml:space="preserve"> </w:t>
+      </w:r>
+      <w:proofErr w:type="spellStart"/>
+      <w:r>
+        <w:rPr>
+          <w:sz w:val="28"/>
+        </w:rPr>
+        <w:t>dfs</w:t>
+      </w:r>
+      <w:proofErr w:type="spellEnd"/>
+      <w:r>
+        <w:rPr>
+          <w:sz w:val="28"/>
+        </w:rPr>
+        <w:t>–</w:t>
+      </w:r>
+      <w:proofErr w:type="spellStart"/>
+      <w:r>
+        <w:rPr>
+          <w:sz w:val="28"/>
+        </w:rPr>
+        <w:t>mkdir</w:t>
+      </w:r>
+      <w:proofErr w:type="spellEnd"/>
+      <w:r>
+        <w:rPr>
+          <w:sz w:val="28"/>
+        </w:rPr>
+        <w:t xml:space="preserve"> /</w:t>
+      </w:r>
+      <w:proofErr w:type="spellStart"/>
+      <w:r>
+        <w:rPr>
+          <w:sz w:val="28"/>
+        </w:rPr>
+        <w:t>soumyadeep</w:t>
+      </w:r>
+      <w:proofErr w:type="spellEnd"/>
+      <w:r>
+        <w:rPr>
+          <w:sz w:val="28"/>
+        </w:rPr>
+        <w:t xml:space="preserve"> </w:t>
+      </w:r>
+      <w:proofErr w:type="gramStart"/>
+      <w:r>
+        <w:rPr>
+          <w:sz w:val="28"/>
+        </w:rPr>
+        <w:t xml:space="preserve">   (</w:t>
+      </w:r>
+      <w:proofErr w:type="gramEnd"/>
+      <w:r>
+        <w:rPr>
+          <w:sz w:val="28"/>
+        </w:rPr>
+        <w:t xml:space="preserve">filename -&gt; </w:t>
+      </w:r>
+      <w:proofErr w:type="spellStart"/>
+      <w:r>
+        <w:rPr>
+          <w:sz w:val="28"/>
+        </w:rPr>
+        <w:t>soumyadeep</w:t>
+      </w:r>
+      <w:proofErr w:type="spellEnd"/>
+      <w:r>
+        <w:rPr>
+          <w:sz w:val="28"/>
+        </w:rPr>
+        <w:t>)</w:t>
+      </w:r>
+    </w:p>
+    <w:p>
+      <w:pPr>
+        <w:rPr>
+          <w:b/>
+          <w:sz w:val="28"/>
+        </w:rPr>
+      </w:pPr>
+      <w:r>
+        <w:rPr>
+          <w:noProof/>
+        </w:rPr>
+        <w:pict>
+          <v:shape id="_x0000_s1030" type="#_x0000_t75" style="position:absolute;margin-left:0;margin-top:2pt;width:451pt;height:108pt;z-index:-251645952;mso-position-horizontal-relative:text;mso-position-vertical-relative:text;mso-width-relative:page;mso-height-relative:page" wrapcoords="-36 0 -36 21450 21600 21450 21600 0 -36 0">
+            <v:imagedata r:id="rId11" o:title="Screenshot from 2025-09-12 12-43-08"/>
+            <w10:wrap type="tight"/>
+          </v:shape>
+        </w:pict>
+      </w:r>
+    </w:p>
+    <w:p>
+      <w:pPr>
+        <w:rPr>
+          <w:b/>
+          <w:sz w:val="28"/>
+        </w:rPr>
+      </w:pPr>
+      <w:r>
+        <w:rPr>
+          <w:b/>
+          <w:sz w:val="28"/>
+        </w:rPr>
+        <w:t>Create Multiple Directories at once:</w:t>
+      </w:r>
+    </w:p>
+    <w:p>
+      <w:pPr>
+        <w:pStyle w:val="ListParagraph"/>
+        <w:numPr>
+          <w:ilvl w:val="0"/>
+          <w:numId w:val="1"/>
+        </w:numPr>
+        <w:rPr>
+          <w:sz w:val="28"/>
+        </w:rPr>
+      </w:pPr>
+      <w:proofErr w:type="spellStart"/>
+      <w:r>
+        <w:rPr>
+          <w:sz w:val="28"/>
+        </w:rPr>
+        <w:t>hdfs</w:t>
+      </w:r>
+      <w:proofErr w:type="spellEnd"/>
+      <w:r>
+        <w:rPr>
+          <w:sz w:val="28"/>
+        </w:rPr>
+        <w:t xml:space="preserve"> </w:t>
+      </w:r>
+      <w:proofErr w:type="spellStart"/>
+      <w:r>
+        <w:rPr>
+          <w:sz w:val="28"/>
+        </w:rPr>
+        <w:t>dfs</w:t>
+      </w:r>
+      <w:proofErr w:type="spellEnd"/>
+      <w:r>
+        <w:rPr>
+          <w:sz w:val="28"/>
+        </w:rPr>
+        <w:t>–</w:t>
+      </w:r>
+      <w:proofErr w:type="spellStart"/>
+      <w:r>
+        <w:rPr>
+          <w:sz w:val="28"/>
+        </w:rPr>
+        <w:t>mkdir</w:t>
+      </w:r>
+      <w:proofErr w:type="spellEnd"/>
+      <w:r>
+        <w:rPr>
+          <w:sz w:val="28"/>
+        </w:rPr>
+        <w:t>-p /</w:t>
+      </w:r>
+      <w:proofErr w:type="spellStart"/>
+      <w:r>
+        <w:rPr>
+          <w:sz w:val="28"/>
+        </w:rPr>
+        <w:t>soumyadeep</w:t>
+      </w:r>
+      <w:proofErr w:type="spellEnd"/>
+      <w:r>
+        <w:rPr>
+          <w:sz w:val="28"/>
+        </w:rPr>
+        <w:t>/</w:t>
+      </w:r>
+      <w:r>
+        <w:rPr>
+          <w:sz w:val="28"/>
+        </w:rPr>
+        <w:t>dir1</w:t>
+      </w:r>
+    </w:p>
+    <w:p>
+      <w:pPr>
+        <w:rPr>
+          <w:sz w:val="28"/>
+        </w:rPr>
+      </w:pPr>
+    </w:p>
+    <w:p>
+      <w:pPr>
+        <w:rPr>
+          <w:sz w:val="28"/>
+        </w:rPr>
+      </w:pPr>
+    </w:p>
+    <w:p>
+      <w:pPr>
+        <w:rPr>
+          <w:b/>
+          <w:sz w:val="28"/>
+        </w:rPr>
+      </w:pPr>
+      <w:r>
+        <w:rPr>
+          <w:b/>
+          <w:sz w:val="28"/>
+        </w:rPr>
+        <w:lastRenderedPageBreak/>
+        <w:t xml:space="preserve">Put (upload) a file to </w:t>
+      </w:r>
+      <w:proofErr w:type="gramStart"/>
+      <w:r>
+        <w:rPr>
+          <w:b/>
+          <w:sz w:val="28"/>
+        </w:rPr>
+        <w:t>HDFS :</w:t>
+      </w:r>
+      <w:proofErr w:type="gramEnd"/>
+    </w:p>
+    <w:p>
+      <w:pPr>
+        <w:pStyle w:val="ListParagraph"/>
+        <w:numPr>
+          <w:ilvl w:val="0"/>
+          <w:numId w:val="1"/>
+        </w:numPr>
+        <w:rPr>
+          <w:sz w:val="28"/>
+        </w:rPr>
+      </w:pPr>
+      <w:r>
+        <w:rPr>
+          <w:noProof/>
+        </w:rPr>
+        <w:pict>
+          <v:shape id="_x0000_s1031" type="#_x0000_t75" style="position:absolute;left:0;text-align:left;margin-left:0;margin-top:31.35pt;width:451pt;height:40.1pt;z-index:-251643904;mso-position-horizontal-relative:text;mso-position-vertical-relative:text;mso-width-relative:page;mso-height-relative:page" wrapcoords="-36 0 -36 21192 21600 21192 21600 0 -36 0">
+            <v:imagedata r:id="rId12" o:title="Screenshot from 2025-09-12 12-53-04"/>
+            <w10:wrap type="tight"/>
+          </v:shape>
+        </w:pict>
+      </w:r>
+      <w:proofErr w:type="spellStart"/>
+      <w:r>
+        <w:rPr>
+          <w:sz w:val="28"/>
+        </w:rPr>
+        <w:t>hdfs</w:t>
+      </w:r>
+      <w:proofErr w:type="spellEnd"/>
+      <w:r>
+        <w:rPr>
+          <w:sz w:val="28"/>
+        </w:rPr>
+        <w:t xml:space="preserve"> </w:t>
+      </w:r>
+      <w:proofErr w:type="spellStart"/>
+      <w:r>
+        <w:rPr>
+          <w:sz w:val="28"/>
+        </w:rPr>
+        <w:t>dfs</w:t>
+      </w:r>
+      <w:proofErr w:type="spellEnd"/>
+      <w:r>
+        <w:rPr>
+          <w:sz w:val="28"/>
+        </w:rPr>
+        <w:t xml:space="preserve">-put </w:t>
+      </w:r>
+      <w:r>
+        <w:rPr>
+          <w:sz w:val="28"/>
+        </w:rPr>
+        <w:t>Desktop/soumyadeep</w:t>
+      </w:r>
+      <w:r>
+        <w:rPr>
+          <w:sz w:val="28"/>
+        </w:rPr>
+        <w:t>.txt /</w:t>
+      </w:r>
+      <w:r>
+        <w:rPr>
+          <w:sz w:val="28"/>
+        </w:rPr>
+        <w:t>Soumyadeep</w:t>
+      </w:r>
+    </w:p>
+    <w:p>
+      <w:pPr>
+        <w:ind w:left="360"/>
+        <w:rPr>
+          <w:sz w:val="28"/>
+        </w:rPr>
+      </w:pPr>
+      <w:r>
+        <w:rPr>
+          <w:noProof/>
+        </w:rPr>
+        <w:pict>
+          <v:shape id="_x0000_s1032" type="#_x0000_t75" style="position:absolute;left:0;text-align:left;margin-left:0;margin-top:68.8pt;width:451pt;height:148.1pt;z-index:-251641856;mso-position-horizontal-relative:text;mso-position-vertical-relative:text;mso-width-relative:page;mso-height-relative:page" wrapcoords="-36 -110 -36 21600 21636 21600 21636 -110 -36 -110" stroked="t" strokecolor="black [3213]">
+            <v:imagedata r:id="rId13" o:title="Screenshot from 2025-09-12 12-54-08"/>
+            <w10:wrap type="tight"/>
+          </v:shape>
+        </w:pict>
+      </w:r>
+    </w:p>
+    <w:p>
+      <w:pPr>
+        <w:rPr>
+          <w:b/>
+          <w:sz w:val="28"/>
+        </w:rPr>
+      </w:pPr>
+      <w:r>
+        <w:rPr>
+          <w:b/>
+          <w:sz w:val="28"/>
+        </w:rPr>
+        <w:t>Get (download) a file from HDFS:</w:t>
+      </w:r>
+    </w:p>
+    <w:p>
+      <w:pPr>
+        <w:pStyle w:val="ListParagraph"/>
+        <w:numPr>
+          <w:ilvl w:val="0"/>
+          <w:numId w:val="1"/>
+        </w:numPr>
+        <w:rPr>
+          <w:sz w:val="28"/>
+        </w:rPr>
+      </w:pPr>
+      <w:r>
+        <w:rPr>
+          <w:noProof/>
+        </w:rPr>
+        <w:pict>
+          <v:shape id="_x0000_s1033" type="#_x0000_t75" style="position:absolute;left:0;text-align:left;margin-left:6.15pt;margin-top:37.55pt;width:451pt;height:46.85pt;z-index:-251639808;mso-position-horizontal-relative:text;mso-position-vertical-relative:text;mso-width-relative:page;mso-height-relative:page" wrapcoords="-36 0 -36 21252 21600 21252 21600 0 -36 0">
+            <v:imagedata r:id="rId14" o:title="Screenshot from 2025-09-12 13-01-25"/>
+            <w10:wrap type="tight"/>
+          </v:shape>
+        </w:pict>
+      </w:r>
+      <w:proofErr w:type="spellStart"/>
+      <w:r>
+        <w:rPr>
+          <w:sz w:val="28"/>
+        </w:rPr>
+        <w:t>hdfs</w:t>
+      </w:r>
+      <w:proofErr w:type="spellEnd"/>
+      <w:r>
+        <w:rPr>
+          <w:sz w:val="28"/>
+        </w:rPr>
+        <w:t xml:space="preserve"> </w:t>
+      </w:r>
+      <w:proofErr w:type="spellStart"/>
+      <w:r>
+        <w:rPr>
+          <w:sz w:val="28"/>
+        </w:rPr>
+        <w:t>dfs</w:t>
+      </w:r>
+      <w:proofErr w:type="spellEnd"/>
+      <w:r>
+        <w:rPr>
+          <w:sz w:val="28"/>
+        </w:rPr>
+        <w:t>–get /</w:t>
+      </w:r>
+      <w:proofErr w:type="spellStart"/>
+      <w:r>
+        <w:rPr>
+          <w:sz w:val="28"/>
+        </w:rPr>
+        <w:t>soumyadeep</w:t>
+      </w:r>
+      <w:proofErr w:type="spellEnd"/>
+      <w:r>
+        <w:rPr>
+          <w:sz w:val="28"/>
+        </w:rPr>
+        <w:t>/</w:t>
+      </w:r>
+      <w:r>
+        <w:rPr>
+          <w:sz w:val="28"/>
+        </w:rPr>
+        <w:t>file2</w:t>
+      </w:r>
+      <w:r>
+        <w:rPr>
+          <w:sz w:val="28"/>
+        </w:rPr>
+        <w:t>.txt</w:t>
+      </w:r>
+    </w:p>
+    <w:p>
+      <w:pPr>
+        <w:rPr>
+          <w:b/>
+          <w:sz w:val="28"/>
+        </w:rPr>
+      </w:pPr>
+      <w:r>
+        <w:rPr>
+          <w:b/>
+          <w:sz w:val="28"/>
+        </w:rPr>
+        <w:t xml:space="preserve">Remove a </w:t>
+      </w:r>
+      <w:proofErr w:type="gramStart"/>
+      <w:r>
+        <w:rPr>
+          <w:b/>
+          <w:sz w:val="28"/>
+        </w:rPr>
+        <w:t>file :</w:t>
+      </w:r>
+      <w:proofErr w:type="gramEnd"/>
+    </w:p>
+    <w:p>
+      <w:pPr>
+        <w:pStyle w:val="ListParagraph"/>
+        <w:numPr>
+          <w:ilvl w:val="0"/>
+          <w:numId w:val="1"/>
+        </w:numPr>
+        <w:rPr>
+          <w:b/>
+          <w:sz w:val="28"/>
+        </w:rPr>
+      </w:pPr>
+      <w:r>
+        <w:rPr>
+          <w:noProof/>
+        </w:rPr>
+        <w:pict>
+          <v:shape id="_x0000_s1035" type="#_x0000_t75" style="position:absolute;left:0;text-align:left;margin-left:0;margin-top:88.3pt;width:364.05pt;height:160.1pt;z-index:-251635712;mso-position-horizontal-relative:text;mso-position-vertical-relative:text;mso-width-relative:page;mso-height-relative:page" wrapcoords="-45 -101 -45 21600 21645 21600 21645 -101 -45 -101" stroked="t" strokecolor="black [3213]">
+            <v:imagedata r:id="rId15" o:title="Screenshot from 2025-09-12 13-02-43"/>
+            <w10:wrap type="tight"/>
+          </v:shape>
+        </w:pict>
+      </w:r>
+      <w:r>
+        <w:rPr>
+          <w:noProof/>
+        </w:rPr>
+        <w:pict>
+          <v:shape id="_x0000_s1034" type="#_x0000_t75" style="position:absolute;left:0;text-align:left;margin-left:0;margin-top:26.8pt;width:451pt;height:57.05pt;z-index:-251637760;mso-position-horizontal-relative:text;mso-position-vertical-relative:text;mso-width-relative:page;mso-height-relative:page" wrapcoords="-36 0 -36 21316 21600 21316 21600 0 -36 0">
+            <v:imagedata r:id="rId16" o:title="Screenshot from 2025-09-12 13-02-13"/>
+            <w10:wrap type="tight"/>
+          </v:shape>
+        </w:pict>
+      </w:r>
+      <w:proofErr w:type="spellStart"/>
+      <w:r>
+        <w:rPr>
+          <w:sz w:val="28"/>
+        </w:rPr>
+        <w:t>hdfs</w:t>
+      </w:r>
+      <w:proofErr w:type="spellEnd"/>
+      <w:r>
+        <w:rPr>
+          <w:sz w:val="28"/>
+        </w:rPr>
+        <w:t xml:space="preserve"> </w:t>
+      </w:r>
+      <w:proofErr w:type="spellStart"/>
+      <w:r>
+        <w:rPr>
+          <w:sz w:val="28"/>
+        </w:rPr>
+        <w:t>dfs-rm</w:t>
+      </w:r>
+      <w:proofErr w:type="spellEnd"/>
+      <w:r>
+        <w:rPr>
+          <w:sz w:val="28"/>
+        </w:rPr>
+        <w:t xml:space="preserve"> /</w:t>
+      </w:r>
+      <w:proofErr w:type="spellStart"/>
+      <w:r>
+        <w:rPr>
+          <w:sz w:val="28"/>
+        </w:rPr>
+        <w:t>myfolder</w:t>
+      </w:r>
+      <w:proofErr w:type="spellEnd"/>
+      <w:r>
+        <w:rPr>
+          <w:sz w:val="28"/>
+        </w:rPr>
+        <w:t>/data.txt</w:t>
+      </w:r>
+    </w:p>
+    <w:p/>
+    <w:p/>
+    <w:p/>
+    <w:p/>
+    <w:p/>
+    <w:p/>
+    <w:p/>
+    <w:p>
+      <w:pPr>
+        <w:rPr>
+          <w:b/>
+          <w:sz w:val="28"/>
+        </w:rPr>
+      </w:pPr>
+      <w:r>
+        <w:rPr>
+          <w:b/>
+          <w:sz w:val="28"/>
+        </w:rPr>
+        <w:lastRenderedPageBreak/>
+        <w:t>Remove a file Recursively: (This will delete files/folders permanently)</w:t>
+      </w:r>
+    </w:p>
+    <w:p>
+      <w:pPr>
+        <w:pStyle w:val="ListParagraph"/>
+        <w:numPr>
+          <w:ilvl w:val="0"/>
+          <w:numId w:val="1"/>
+        </w:numPr>
+        <w:rPr>
+          <w:sz w:val="28"/>
+        </w:rPr>
+      </w:pPr>
+      <w:r>
+        <w:rPr>
+          <w:noProof/>
+        </w:rPr>
+        <w:pict>
+          <v:shape id="_x0000_s1039" type="#_x0000_t75" style="position:absolute;left:0;text-align:left;margin-left:0;margin-top:90.35pt;width:412.3pt;height:172pt;z-index:-251627520;mso-position-horizontal-relative:text;mso-position-vertical-relative:text;mso-width-relative:page;mso-height-relative:page" wrapcoords="-36 -86 -36 21600 21636 21600 21636 -86 -36 -86" stroked="t" strokecolor="black [3213]">
+            <v:imagedata r:id="rId7" o:title="Screenshot from 2025-09-12 13-06-42"/>
+            <w10:wrap type="tight"/>
+          </v:shape>
+        </w:pict>
+      </w:r>
+      <w:proofErr w:type="spellStart"/>
+      <w:r>
+        <w:rPr>
+          <w:sz w:val="28"/>
+        </w:rPr>
+        <w:t>hdfs</w:t>
+      </w:r>
+      <w:proofErr w:type="spellEnd"/>
+      <w:r>
+        <w:rPr>
+          <w:sz w:val="28"/>
+        </w:rPr>
+        <w:t xml:space="preserve"> </w:t>
+      </w:r>
+      <w:proofErr w:type="spellStart"/>
+      <w:r>
+        <w:rPr>
+          <w:sz w:val="28"/>
+        </w:rPr>
+        <w:t>dfs-rm</w:t>
+      </w:r>
+      <w:proofErr w:type="spellEnd"/>
+      <w:r>
+        <w:rPr>
+          <w:sz w:val="28"/>
+        </w:rPr>
+        <w:t xml:space="preserve"> -r /</w:t>
+      </w:r>
+      <w:r>
+        <w:rPr>
+          <w:sz w:val="28"/>
+        </w:rPr>
+        <w:t>Soumyadeep</w:t>
+      </w:r>
+    </w:p>
+    <w:p>
+      <w:pPr>
+        <w:rPr>
+          <w:sz w:val="28"/>
+        </w:rPr>
+      </w:pPr>
+      <w:r>
+        <w:rPr>
+          <w:noProof/>
+        </w:rPr>
+        <w:pict>
+          <v:shape id="_x0000_s1038" type="#_x0000_t75" style="position:absolute;margin-left:0;margin-top:-.55pt;width:451pt;height:52.3pt;z-index:-251629568;mso-position-horizontal:absolute;mso-position-horizontal-relative:text;mso-position-vertical:absolute;mso-position-vertical-relative:text;mso-width-relative:page;mso-height-relative:page" wrapcoords="-36 0 -36 21291 21600 21291 21600 0 -36 0">
+            <v:imagedata r:id="rId17" o:title="Screenshot from 2025-09-12 13-06-12"/>
+            <w10:wrap type="tight"/>
+          </v:shape>
+        </w:pict>
+      </w:r>
+    </w:p>
+    <w:p>
+      <w:pPr>
+        <w:rPr>
+          <w:sz w:val="28"/>
+        </w:rPr>
+      </w:pPr>
+    </w:p>
+    <w:p>
+      <w:pPr>
+        <w:rPr>
+          <w:b/>
+          <w:sz w:val="28"/>
+        </w:rPr>
+      </w:pPr>
+    </w:p>
+    <w:p>
+      <w:pPr>
+        <w:rPr>
+          <w:b/>
+          <w:sz w:val="28"/>
+        </w:rPr>
+      </w:pPr>
+    </w:p>
+    <w:p>
+      <w:pPr>
+        <w:rPr>
+          <w:b/>
+          <w:sz w:val="28"/>
+        </w:rPr>
+      </w:pPr>
+    </w:p>
+    <w:p>
+      <w:pPr>
+        <w:rPr>
+          <w:b/>
+          <w:sz w:val="28"/>
+        </w:rPr>
+      </w:pPr>
+    </w:p>
+    <w:p>
+      <w:pPr>
+        <w:rPr>
+          <w:b/>
+          <w:sz w:val="28"/>
+        </w:rPr>
+      </w:pPr>
+    </w:p>
+    <w:p>
+      <w:pPr>
+        <w:rPr>
+          <w:b/>
+          <w:sz w:val="28"/>
+        </w:rPr>
+      </w:pPr>
+    </w:p>
+    <w:p>
+      <w:pPr>
+        <w:rPr>
+          <w:b/>
+          <w:sz w:val="28"/>
+        </w:rPr>
+      </w:pPr>
+      <w:r>
+        <w:rPr>
+          <w:b/>
+          <w:sz w:val="28"/>
+        </w:rPr>
+        <w:t xml:space="preserve">View file </w:t>
+      </w:r>
+      <w:proofErr w:type="gramStart"/>
+      <w:r>
+        <w:rPr>
+          <w:b/>
+          <w:sz w:val="28"/>
+        </w:rPr>
+        <w:t>contents :</w:t>
+      </w:r>
+      <w:proofErr w:type="gramEnd"/>
+    </w:p>
+    <w:p>
+      <w:pPr>
+        <w:pStyle w:val="ListParagraph"/>
+        <w:numPr>
+          <w:ilvl w:val="0"/>
+          <w:numId w:val="1"/>
+        </w:numPr>
+        <w:rPr>
+          <w:sz w:val="28"/>
+        </w:rPr>
+      </w:pPr>
+      <w:r>
+        <w:rPr>
+          <w:noProof/>
+        </w:rPr>
+        <w:pict>
+          <v:shape id="_x0000_s1036" type="#_x0000_t75" style="position:absolute;left:0;text-align:left;margin-left:.65pt;margin-top:24pt;width:450.35pt;height:52.3pt;z-index:-251633664;mso-position-horizontal-relative:text;mso-position-vertical-relative:text;mso-width-relative:page;mso-height-relative:page" wrapcoords="-36 0 -36 21291 21600 21291 21600 0 -36 0">
+            <v:imagedata r:id="rId18" o:title="Screenshot from 2025-09-12 13-04-14"/>
+            <w10:wrap type="tight"/>
+          </v:shape>
+        </w:pict>
+      </w:r>
+      <w:proofErr w:type="spellStart"/>
+      <w:r>
+        <w:rPr>
+          <w:sz w:val="28"/>
+        </w:rPr>
+        <w:t>hdfs</w:t>
+      </w:r>
+      <w:proofErr w:type="spellEnd"/>
+      <w:r>
+        <w:rPr>
+          <w:sz w:val="28"/>
+        </w:rPr>
+        <w:t xml:space="preserve"> </w:t>
+      </w:r>
+      <w:proofErr w:type="spellStart"/>
+      <w:r>
+        <w:rPr>
+          <w:sz w:val="28"/>
+        </w:rPr>
+        <w:t>dfs</w:t>
+      </w:r>
+      <w:proofErr w:type="spellEnd"/>
+      <w:r>
+        <w:rPr>
+          <w:sz w:val="28"/>
+        </w:rPr>
+        <w:t>-cat /</w:t>
+      </w:r>
+      <w:proofErr w:type="spellStart"/>
+      <w:r>
+        <w:rPr>
+          <w:sz w:val="28"/>
+        </w:rPr>
+        <w:t>soumyadeep</w:t>
+      </w:r>
+      <w:proofErr w:type="spellEnd"/>
+      <w:r>
+        <w:rPr>
+          <w:sz w:val="28"/>
+        </w:rPr>
+        <w:t>/</w:t>
+      </w:r>
+      <w:r>
+        <w:rPr>
+          <w:sz w:val="28"/>
+        </w:rPr>
+        <w:t>soumyadeep</w:t>
+      </w:r>
+      <w:r>
+        <w:rPr>
+          <w:sz w:val="28"/>
+        </w:rPr>
+        <w:t>.txt</w:t>
+      </w:r>
+    </w:p>
+    <w:p>
+      <w:pPr>
+        <w:rPr>
+          <w:sz w:val="28"/>
+        </w:rPr>
+      </w:pPr>
+    </w:p>
+    <w:p>
+      <w:pPr>
+        <w:rPr>
+          <w:b/>
+          <w:sz w:val="28"/>
+        </w:rPr>
+      </w:pPr>
+      <w:r>
+        <w:rPr>
+          <w:b/>
+          <w:sz w:val="28"/>
+        </w:rPr>
+        <w:t xml:space="preserve">Display first few lines: </w:t>
+      </w:r>
+    </w:p>
+    <w:p>
+      <w:pPr>
+        <w:pStyle w:val="ListParagraph"/>
+        <w:numPr>
+          <w:ilvl w:val="0"/>
+          <w:numId w:val="1"/>
+        </w:numPr>
+        <w:rPr>
+          <w:sz w:val="28"/>
+        </w:rPr>
+      </w:pPr>
+      <w:proofErr w:type="spellStart"/>
+      <w:r>
+        <w:rPr>
+          <w:sz w:val="28"/>
+        </w:rPr>
+        <w:t>hdfs</w:t>
+      </w:r>
+      <w:proofErr w:type="spellEnd"/>
+      <w:r>
+        <w:rPr>
+          <w:sz w:val="28"/>
+        </w:rPr>
+        <w:t xml:space="preserve"> </w:t>
+      </w:r>
+      <w:proofErr w:type="spellStart"/>
+      <w:r>
+        <w:rPr>
+          <w:sz w:val="28"/>
+        </w:rPr>
+        <w:t>dfs</w:t>
+      </w:r>
+      <w:proofErr w:type="spellEnd"/>
+      <w:r>
+        <w:rPr>
+          <w:sz w:val="28"/>
+        </w:rPr>
+        <w:t>-head /</w:t>
+      </w:r>
+      <w:proofErr w:type="spellStart"/>
+      <w:r>
+        <w:rPr>
+          <w:sz w:val="28"/>
+        </w:rPr>
+        <w:t>soumyadeep</w:t>
+      </w:r>
+      <w:proofErr w:type="spellEnd"/>
+      <w:r>
+        <w:rPr>
+          <w:sz w:val="28"/>
+        </w:rPr>
+        <w:t xml:space="preserve"> </w:t>
+      </w:r>
+      <w:r>
+        <w:rPr>
+          <w:sz w:val="28"/>
+        </w:rPr>
+        <w:t>/</w:t>
+      </w:r>
+      <w:r>
+        <w:rPr>
+          <w:sz w:val="28"/>
+        </w:rPr>
+        <w:t>soumyadeep</w:t>
+      </w:r>
+      <w:r>
+        <w:rPr>
+          <w:sz w:val="28"/>
+        </w:rPr>
+        <w:t>.txt</w:t>
+      </w:r>
+    </w:p>
+    <w:p>
+      <w:pPr>
+        <w:rPr>
+          <w:b/>
+          <w:sz w:val="28"/>
+        </w:rPr>
+      </w:pPr>
+      <w:r>
+        <w:rPr>
+          <w:b/>
+          <w:sz w:val="28"/>
+        </w:rPr>
+        <w:t>Display last few lines</w:t>
+      </w:r>
+      <w:r>
+        <w:rPr>
+          <w:b/>
+          <w:sz w:val="28"/>
+        </w:rPr>
+        <w:t xml:space="preserve">: </w:t>
+      </w:r>
+    </w:p>
+    <w:p>
+      <w:pPr>
+        <w:pStyle w:val="ListParagraph"/>
+        <w:numPr>
+          <w:ilvl w:val="0"/>
+          <w:numId w:val="1"/>
+        </w:numPr>
+        <w:rPr>
+          <w:sz w:val="28"/>
+        </w:rPr>
+      </w:pPr>
+      <w:r>
+        <w:rPr>
+          <w:noProof/>
+        </w:rPr>
+        <w:pict>
+          <v:shape id="_x0000_s1037" type="#_x0000_t75" style="position:absolute;left:0;text-align:left;margin-left:0;margin-top:42.95pt;width:451pt;height:90.35pt;z-index:-251631616;mso-position-horizontal-relative:text;mso-position-vertical-relative:text;mso-width-relative:page;mso-height-relative:page" wrapcoords="-36 0 -36 21420 21600 21420 21600 0 -36 0">
+            <v:imagedata r:id="rId19" o:title="Screenshot from 2025-09-12 13-05-09"/>
+            <w10:wrap type="tight"/>
+          </v:shape>
+        </w:pict>
+      </w:r>
+      <w:proofErr w:type="spellStart"/>
+      <w:r>
+        <w:rPr>
+          <w:sz w:val="28"/>
+        </w:rPr>
+        <w:t>hdfs</w:t>
+      </w:r>
+      <w:proofErr w:type="spellEnd"/>
+      <w:r>
+        <w:rPr>
+          <w:sz w:val="28"/>
+        </w:rPr>
+        <w:t xml:space="preserve"> </w:t>
+      </w:r>
+      <w:proofErr w:type="spellStart"/>
+      <w:r>
+        <w:rPr>
+          <w:sz w:val="28"/>
+        </w:rPr>
+        <w:t>dfs</w:t>
+      </w:r>
+      <w:proofErr w:type="spellEnd"/>
+      <w:r>
+        <w:rPr>
+          <w:sz w:val="28"/>
+        </w:rPr>
+        <w:t>-tail /</w:t>
+      </w:r>
+      <w:r>
+        <w:rPr>
+          <w:sz w:val="28"/>
+        </w:rPr>
+        <w:t xml:space="preserve"> </w:t>
+      </w:r>
+      <w:proofErr w:type="spellStart"/>
+      <w:r>
+        <w:rPr>
+          <w:sz w:val="28"/>
+        </w:rPr>
+        <w:t>soumyadeep</w:t>
+      </w:r>
+      <w:proofErr w:type="spellEnd"/>
+      <w:r>
+        <w:rPr>
+          <w:sz w:val="28"/>
+        </w:rPr>
+        <w:t xml:space="preserve"> /</w:t>
+      </w:r>
+      <w:r>
+        <w:rPr>
+          <w:sz w:val="28"/>
+        </w:rPr>
+        <w:t xml:space="preserve"> </w:t>
+      </w:r>
+      <w:r>
+        <w:rPr>
+          <w:sz w:val="28"/>
+        </w:rPr>
+        <w:t>soumyadeep.txt</w:t>
+      </w:r>
     </w:p>
     <w:p>
       <w:pPr>
@@ -655,13 +1724,6 @@
       </w:pPr>
       <w:bookmarkStart w:id="0" w:name="_GoBack"/>
       <w:bookmarkEnd w:id="0"/>
-    </w:p>
-    <w:p>
-      <w:pPr>
-        <w:rPr>
-          <w:sz w:val="28"/>
-        </w:rPr>
-      </w:pPr>
     </w:p>
     <w:sectPr>
       <w:pgSz w:w="11906" w:h="16838"/>
@@ -671,6 +1733,126 @@
     </w:sectPr>
   </w:body>
 </w:document>
+</file>
+
+<file path=word/numbering.xml><?xml version="1.0" encoding="utf-8"?>
+<w:numbering xmlns:wpc="http://schemas.microsoft.com/office/word/2010/wordprocessingCanvas" xmlns:cx="http://schemas.microsoft.com/office/drawing/2014/chartex" xmlns:mc="http://schemas.openxmlformats.org/markup-compatibility/2006" xmlns:o="urn:schemas-microsoft-com:office:office" xmlns:r="http://schemas.openxmlformats.org/officeDocument/2006/relationships" xmlns:m="http://schemas.openxmlformats.org/officeDocument/2006/math" xmlns:v="urn:schemas-microsoft-com:vml" xmlns:wp14="http://schemas.microsoft.com/office/word/2010/wordprocessingDrawing" xmlns:wp="http://schemas.openxmlformats.org/drawingml/2006/wordprocessingDrawing" xmlns:w10="urn:schemas-microsoft-com:office:word" xmlns:w="http://schemas.openxmlformats.org/wordprocessingml/2006/main" xmlns:w14="http://schemas.microsoft.com/office/word/2010/wordml" xmlns:w15="http://schemas.microsoft.com/office/word/2012/wordml" xmlns:w16se="http://schemas.microsoft.com/office/word/2015/wordml/symex" xmlns:wpg="http://schemas.microsoft.com/office/word/2010/wordprocessingGroup" xmlns:wpi="http://schemas.microsoft.com/office/word/2010/wordprocessingInk" xmlns:wne="http://schemas.microsoft.com/office/word/2006/wordml" xmlns:wps="http://schemas.microsoft.com/office/word/2010/wordprocessingShape" mc:Ignorable="w14 w15 w16se wp14">
+  <w:abstractNum w:abstractNumId="0" w15:restartNumberingAfterBreak="0">
+    <w:nsid w:val="5CDC3DED"/>
+    <w:multiLevelType w:val="hybridMultilevel"/>
+    <w:tmpl w:val="6854D660"/>
+    <w:lvl w:ilvl="0" w:tplc="22C2D900">
+      <w:numFmt w:val="bullet"/>
+      <w:lvlText w:val=""/>
+      <w:lvlJc w:val="left"/>
+      <w:pPr>
+        <w:ind w:left="720" w:hanging="360"/>
+      </w:pPr>
+      <w:rPr>
+        <w:rFonts w:ascii="Wingdings" w:eastAsiaTheme="minorHAnsi" w:hAnsi="Wingdings" w:cstheme="minorBidi" w:hint="default"/>
+      </w:rPr>
+    </w:lvl>
+    <w:lvl w:ilvl="1" w:tplc="40090003" w:tentative="1">
+      <w:start w:val="1"/>
+      <w:numFmt w:val="bullet"/>
+      <w:lvlText w:val="o"/>
+      <w:lvlJc w:val="left"/>
+      <w:pPr>
+        <w:ind w:left="1440" w:hanging="360"/>
+      </w:pPr>
+      <w:rPr>
+        <w:rFonts w:ascii="Courier New" w:hAnsi="Courier New" w:cs="Courier New" w:hint="default"/>
+      </w:rPr>
+    </w:lvl>
+    <w:lvl w:ilvl="2" w:tplc="40090005" w:tentative="1">
+      <w:start w:val="1"/>
+      <w:numFmt w:val="bullet"/>
+      <w:lvlText w:val=""/>
+      <w:lvlJc w:val="left"/>
+      <w:pPr>
+        <w:ind w:left="2160" w:hanging="360"/>
+      </w:pPr>
+      <w:rPr>
+        <w:rFonts w:ascii="Wingdings" w:hAnsi="Wingdings" w:hint="default"/>
+      </w:rPr>
+    </w:lvl>
+    <w:lvl w:ilvl="3" w:tplc="40090001" w:tentative="1">
+      <w:start w:val="1"/>
+      <w:numFmt w:val="bullet"/>
+      <w:lvlText w:val=""/>
+      <w:lvlJc w:val="left"/>
+      <w:pPr>
+        <w:ind w:left="2880" w:hanging="360"/>
+      </w:pPr>
+      <w:rPr>
+        <w:rFonts w:ascii="Symbol" w:hAnsi="Symbol" w:hint="default"/>
+      </w:rPr>
+    </w:lvl>
+    <w:lvl w:ilvl="4" w:tplc="40090003" w:tentative="1">
+      <w:start w:val="1"/>
+      <w:numFmt w:val="bullet"/>
+      <w:lvlText w:val="o"/>
+      <w:lvlJc w:val="left"/>
+      <w:pPr>
+        <w:ind w:left="3600" w:hanging="360"/>
+      </w:pPr>
+      <w:rPr>
+        <w:rFonts w:ascii="Courier New" w:hAnsi="Courier New" w:cs="Courier New" w:hint="default"/>
+      </w:rPr>
+    </w:lvl>
+    <w:lvl w:ilvl="5" w:tplc="40090005" w:tentative="1">
+      <w:start w:val="1"/>
+      <w:numFmt w:val="bullet"/>
+      <w:lvlText w:val=""/>
+      <w:lvlJc w:val="left"/>
+      <w:pPr>
+        <w:ind w:left="4320" w:hanging="360"/>
+      </w:pPr>
+      <w:rPr>
+        <w:rFonts w:ascii="Wingdings" w:hAnsi="Wingdings" w:hint="default"/>
+      </w:rPr>
+    </w:lvl>
+    <w:lvl w:ilvl="6" w:tplc="40090001" w:tentative="1">
+      <w:start w:val="1"/>
+      <w:numFmt w:val="bullet"/>
+      <w:lvlText w:val=""/>
+      <w:lvlJc w:val="left"/>
+      <w:pPr>
+        <w:ind w:left="5040" w:hanging="360"/>
+      </w:pPr>
+      <w:rPr>
+        <w:rFonts w:ascii="Symbol" w:hAnsi="Symbol" w:hint="default"/>
+      </w:rPr>
+    </w:lvl>
+    <w:lvl w:ilvl="7" w:tplc="40090003" w:tentative="1">
+      <w:start w:val="1"/>
+      <w:numFmt w:val="bullet"/>
+      <w:lvlText w:val="o"/>
+      <w:lvlJc w:val="left"/>
+      <w:pPr>
+        <w:ind w:left="5760" w:hanging="360"/>
+      </w:pPr>
+      <w:rPr>
+        <w:rFonts w:ascii="Courier New" w:hAnsi="Courier New" w:cs="Courier New" w:hint="default"/>
+      </w:rPr>
+    </w:lvl>
+    <w:lvl w:ilvl="8" w:tplc="40090005" w:tentative="1">
+      <w:start w:val="1"/>
+      <w:numFmt w:val="bullet"/>
+      <w:lvlText w:val=""/>
+      <w:lvlJc w:val="left"/>
+      <w:pPr>
+        <w:ind w:left="6480" w:hanging="360"/>
+      </w:pPr>
+      <w:rPr>
+        <w:rFonts w:ascii="Wingdings" w:hAnsi="Wingdings" w:hint="default"/>
+      </w:rPr>
+    </w:lvl>
+  </w:abstractNum>
+  <w:num w:numId="1">
+    <w:abstractNumId w:val="0"/>
+  </w:num>
+</w:numbering>
 </file>
 
 <file path=word/styles.xml><?xml version="1.0" encoding="utf-8"?>
@@ -1095,6 +2277,17 @@
     <w:semiHidden/>
     <w:unhideWhenUsed/>
   </w:style>
+  <w:style w:type="paragraph" w:styleId="ListParagraph">
+    <w:name w:val="List Paragraph"/>
+    <w:basedOn w:val="Normal"/>
+    <w:uiPriority w:val="34"/>
+    <w:qFormat/>
+    <w:rsid w:val="00A16386"/>
+    <w:pPr>
+      <w:ind w:left="720"/>
+      <w:contextualSpacing/>
+    </w:pPr>
+  </w:style>
 </w:styles>
 </file>
 

</xml_diff>